<commit_message>
updated the spec and fixtures and tests.
</commit_message>
<xml_diff>
--- a/collection/margolis-dfu-prognostic/spec/Margolis_2022_DFU_Prognostic_CKS-1_0.docx
+++ b/collection/margolis-dfu-prognostic/spec/Margolis_2022_DFU_Prognostic_CKS-1_0.docx
@@ -11839,6 +11839,15 @@
       </w:pPr>
       <w:r>
         <w:t>Promoted the complete CKS artifact set to Version 1.0 and reconciled the document identifier, visible status, KGrid IRIs, schema identifiers and constants, fixture metadata and expectations, filenames, and internal cross-references.</w:t>
+      </w:r>
+    </w:p>
+    <w:p>
+      <w:pPr>
+        <w:pStyle w:val="ListBullet"/>
+      </w:pPr>
+      <w:r/>
+      <w:r>
+        <w:t>Corrected the Version 1.0 canonical schema basis discriminators to use the declared ucum_code property and corrected TC-05, TC-08, TC-09, TC-14, and TC-16 for threshold equality, rule selection, required equality notices, and exact mm2-to-cm2 normalization; no identifier or version change was made.</w:t>
       </w:r>
     </w:p>
     <w:p>

</xml_diff>